<commit_message>
fix some styling and add more projects
</commit_message>
<xml_diff>
--- a/public/resume/RESUME-LYNNNGO.docx
+++ b/public/resume/RESUME-LYNNNGO.docx
@@ -43,85 +43,116 @@
           <w:szCs w:val="20"/>
         </w:rPr>
       </w:pPr>
-      <w:r>
-        <w:rPr>
-          <w:sz w:val="20"/>
-          <w:szCs w:val="20"/>
-        </w:rPr>
-        <w:t>lynnngo2608</w:t>
-      </w:r>
-      <w:r>
-        <w:rPr>
-          <w:sz w:val="20"/>
-          <w:szCs w:val="20"/>
-        </w:rPr>
-        <w:t>@gmail.com</w:t>
-      </w:r>
-      <w:r>
-        <w:rPr>
-          <w:sz w:val="20"/>
-          <w:szCs w:val="20"/>
-        </w:rPr>
-        <w:t xml:space="preserve">| </w:t>
-      </w:r>
-      <w:r>
-        <w:rPr>
-          <w:sz w:val="20"/>
-          <w:szCs w:val="20"/>
-        </w:rPr>
-        <w:t>0424311988</w:t>
-      </w:r>
-      <w:r>
-        <w:rPr>
-          <w:sz w:val="20"/>
-          <w:szCs w:val="20"/>
-        </w:rPr>
-        <w:t xml:space="preserve"> | </w:t>
-      </w:r>
-      <w:hyperlink r:id="rId5" w:history="1">
+      <w:hyperlink r:id="rId7" w:history="1">
         <w:r>
           <w:rPr>
             <w:rStyle w:val="Hyperlink"/>
             <w:sz w:val="20"/>
             <w:szCs w:val="20"/>
           </w:rPr>
-          <w:t>https://gitfront.io/r/LYNNNGO/rCNTRk7jKhGM/Club-Management-System/</w:t>
+          <w:t>lynnngo2608@gmail.com</w:t>
         </w:r>
       </w:hyperlink>
-    </w:p>
-    <w:p>
-      <w:pPr>
-        <w:pBdr>
-          <w:top w:val="nil"/>
-          <w:left w:val="nil"/>
-          <w:bottom w:val="nil"/>
-          <w:right w:val="nil"/>
-          <w:between w:val="nil"/>
-        </w:pBdr>
-        <w:spacing w:before="20" w:after="20"/>
-        <w:jc w:val="center"/>
+      <w:r>
         <w:rPr>
           <w:sz w:val="20"/>
           <w:szCs w:val="20"/>
         </w:rPr>
-      </w:pPr>
+        <w:t xml:space="preserve"> </w:t>
+      </w:r>
       <w:r>
         <w:rPr>
           <w:sz w:val="20"/>
           <w:szCs w:val="20"/>
         </w:rPr>
+        <w:t xml:space="preserve">| </w:t>
+      </w:r>
+      <w:r>
+        <w:rPr>
+          <w:sz w:val="20"/>
+          <w:szCs w:val="20"/>
+        </w:rPr>
+        <w:t>0424311988</w:t>
+      </w:r>
+      <w:r>
+        <w:rPr>
+          <w:sz w:val="20"/>
+          <w:szCs w:val="20"/>
+        </w:rPr>
+        <w:t>|</w:t>
+      </w:r>
+      <w:r>
+        <w:rPr>
+          <w:sz w:val="20"/>
+          <w:szCs w:val="20"/>
+        </w:rPr>
         <w:t xml:space="preserve"> </w:t>
       </w:r>
-      <w:hyperlink r:id="rId6" w:history="1">
+      <w:hyperlink r:id="rId8" w:history="1">
         <w:r>
           <w:rPr>
             <w:rStyle w:val="Hyperlink"/>
             <w:sz w:val="20"/>
             <w:szCs w:val="20"/>
           </w:rPr>
-          <w:t>https://gitfront.io/r/LYNNNGO/TUUvsvvtFnHV/Shortest-Path-Algorithm-for-Material-Transportation/</w:t>
+          <w:t>https://lynn-portfolio.vercel.app/</w:t>
         </w:r>
       </w:hyperlink>
+      <w:r>
+        <w:rPr>
+          <w:sz w:val="20"/>
+          <w:szCs w:val="20"/>
+        </w:rPr>
+        <w:t xml:space="preserve"> </w:t>
+      </w:r>
+      <w:r>
+        <w:rPr>
+          <w:sz w:val="20"/>
+          <w:szCs w:val="20"/>
+        </w:rPr>
+        <w:t>|</w:t>
+      </w:r>
+      <w:r>
+        <w:rPr>
+          <w:sz w:val="20"/>
+          <w:szCs w:val="20"/>
+        </w:rPr>
+        <w:t xml:space="preserve"> </w:t>
+      </w:r>
+      <w:hyperlink r:id="rId9" w:history="1">
+        <w:r>
+          <w:rPr>
+            <w:rStyle w:val="Hyperlink"/>
+            <w:sz w:val="20"/>
+            <w:szCs w:val="20"/>
+          </w:rPr>
+          <w:t>https://github.com/Linhngo268</w:t>
+        </w:r>
+      </w:hyperlink>
+      <w:r>
+        <w:rPr>
+          <w:sz w:val="20"/>
+          <w:szCs w:val="20"/>
+        </w:rPr>
+        <w:t xml:space="preserve"> | </w:t>
+      </w:r>
+      <w:hyperlink r:id="rId10" w:history="1">
+        <w:r>
+          <w:rPr>
+            <w:rStyle w:val="Hyperlink"/>
+            <w:sz w:val="20"/>
+            <w:szCs w:val="20"/>
+          </w:rPr>
+          <w:t>www.linkedin.com/in/lynn-ngo-3bb5bb241</w:t>
+        </w:r>
+      </w:hyperlink>
+      <w:r>
+        <w:rPr>
+          <w:sz w:val="20"/>
+          <w:szCs w:val="20"/>
+        </w:rPr>
+        <w:t xml:space="preserve"> </w:t>
+      </w:r>
     </w:p>
     <w:p>
       <w:pPr>
@@ -367,22 +398,7 @@
     </w:p>
     <w:p>
       <w:pPr>
-        <w:spacing w:before="20" w:after="20"/>
-        <w:rPr>
-          <w:sz w:val="2"/>
-          <w:szCs w:val="2"/>
-        </w:rPr>
-      </w:pPr>
-    </w:p>
-    <w:p>
-      <w:pPr>
         <w:widowControl/>
-        <w:spacing w:before="20" w:after="20"/>
-        <w:rPr>
-          <w:lang w:val="en-AU" w:eastAsia="zh-CN"/>
-        </w:rPr>
-      </w:pPr>
-      <w:r>
         <w:rPr>
           <w:b/>
           <w:bCs/>
@@ -390,7 +406,16 @@
           <w:szCs w:val="24"/>
           <w:lang w:val="en-AU" w:eastAsia="zh-CN"/>
         </w:rPr>
-        <w:t xml:space="preserve">Get2know  </w:t>
+      </w:pPr>
+      <w:r>
+        <w:rPr>
+          <w:b/>
+          <w:bCs/>
+          <w:sz w:val="24"/>
+          <w:szCs w:val="24"/>
+          <w:lang w:val="en-AU" w:eastAsia="zh-CN"/>
+        </w:rPr>
+        <w:t>Get2know</w:t>
       </w:r>
       <w:r>
         <w:rPr>
@@ -398,7 +423,7 @@
           <w:bCs/>
           <w:lang w:val="en-AU" w:eastAsia="zh-CN"/>
         </w:rPr>
-        <w:t xml:space="preserve">                                                                                     </w:t>
+        <w:t xml:space="preserve"> </w:t>
       </w:r>
       <w:r>
         <w:rPr>
@@ -406,7 +431,7 @@
           <w:bCs/>
           <w:lang w:val="en-AU" w:eastAsia="zh-CN"/>
         </w:rPr>
-        <w:t xml:space="preserve">            </w:t>
+        <w:t xml:space="preserve">                                                                                                 </w:t>
       </w:r>
       <w:r>
         <w:rPr>
@@ -416,30 +441,47 @@
         </w:rPr>
         <w:t>Remote- Sydney, New South Wales, Australia</w:t>
       </w:r>
-      <w:r>
-        <w:rPr>
+    </w:p>
+    <w:p>
+      <w:pPr>
+        <w:widowControl/>
+        <w:rPr>
+          <w:sz w:val="24"/>
+          <w:szCs w:val="24"/>
           <w:lang w:val="en-AU" w:eastAsia="zh-CN"/>
         </w:rPr>
-        <w:br/>
-        <w:t xml:space="preserve">Junior System Analyst                                                                     </w:t>
-      </w:r>
-      <w:r>
-        <w:rPr>
+      </w:pPr>
+      <w:r>
+        <w:rPr>
+          <w:sz w:val="24"/>
+          <w:szCs w:val="24"/>
           <w:lang w:val="en-AU" w:eastAsia="zh-CN"/>
         </w:rPr>
-        <w:t xml:space="preserve"> </w:t>
-      </w:r>
-      <w:r>
-        <w:rPr>
+        <w:t xml:space="preserve">Odoo </w:t>
+      </w:r>
+      <w:r>
+        <w:rPr>
+          <w:sz w:val="24"/>
+          <w:szCs w:val="24"/>
           <w:lang w:val="en-AU" w:eastAsia="zh-CN"/>
         </w:rPr>
-        <w:t xml:space="preserve">             </w:t>
-      </w:r>
-      <w:r>
-        <w:rPr>
+        <w:t xml:space="preserve">Developer </w:t>
+      </w:r>
+      <w:r>
+        <w:rPr>
+          <w:sz w:val="24"/>
+          <w:szCs w:val="24"/>
           <w:lang w:val="en-AU" w:eastAsia="zh-CN"/>
         </w:rPr>
-        <w:t xml:space="preserve">  </w:t>
+        <w:t>- Volunteer</w:t>
+      </w:r>
+      <w:r>
+        <w:rPr>
+          <w:sz w:val="24"/>
+          <w:szCs w:val="24"/>
+          <w:lang w:val="en-AU" w:eastAsia="zh-CN"/>
+        </w:rPr>
+        <w:t xml:space="preserve">                                                                              </w:t>
       </w:r>
       <w:r>
         <w:rPr>
@@ -454,40 +496,39 @@
         <w:widowControl/>
         <w:numPr>
           <w:ilvl w:val="0"/>
-          <w:numId w:val="19"/>
+          <w:numId w:val="22"/>
         </w:numPr>
-        <w:spacing w:before="20" w:after="20"/>
-        <w:rPr>
+        <w:rPr>
+          <w:sz w:val="24"/>
+          <w:szCs w:val="24"/>
           <w:lang w:val="en-AU" w:eastAsia="zh-CN"/>
         </w:rPr>
       </w:pPr>
       <w:r>
         <w:rPr>
+          <w:sz w:val="24"/>
+          <w:szCs w:val="24"/>
           <w:lang w:val="en-AU" w:eastAsia="zh-CN"/>
         </w:rPr>
-        <w:t>Increas</w:t>
+        <w:t>C</w:t>
       </w:r>
       <w:r>
         <w:rPr>
           <w:lang w:val="en-AU" w:eastAsia="zh-CN"/>
         </w:rPr>
-        <w:t>ing</w:t>
-      </w:r>
-      <w:r>
-        <w:rPr>
-          <w:lang w:val="en-AU" w:eastAsia="zh-CN"/>
-        </w:rPr>
-        <w:t xml:space="preserve"> customer satisfaction by 15% through CRM process enhancements using Odoo CRM.</w:t>
+        <w:t>ustomized Odoo websites and modules to develop a new web application, improving user engagement and client workflows.</w:t>
       </w:r>
     </w:p>
     <w:p>
       <w:pPr>
         <w:pStyle w:val="ListParagraph"/>
-        <w:widowControl/>
         <w:numPr>
           <w:ilvl w:val="0"/>
-          <w:numId w:val="19"/>
+          <w:numId w:val="21"/>
         </w:numPr>
+        <w:tabs>
+          <w:tab w:val="right" w:pos="10800"/>
+        </w:tabs>
         <w:spacing w:before="20" w:after="20"/>
         <w:rPr>
           <w:lang w:val="en-AU" w:eastAsia="zh-CN"/>
@@ -497,29 +538,19 @@
         <w:rPr>
           <w:lang w:val="en-AU" w:eastAsia="zh-CN"/>
         </w:rPr>
-        <w:t>Conduct</w:t>
-      </w:r>
-      <w:r>
-        <w:rPr>
-          <w:lang w:val="en-AU" w:eastAsia="zh-CN"/>
-        </w:rPr>
-        <w:t>ing</w:t>
-      </w:r>
-      <w:r>
-        <w:rPr>
-          <w:lang w:val="en-AU" w:eastAsia="zh-CN"/>
-        </w:rPr>
-        <w:t xml:space="preserve"> data analysis and translated business requirements into actionable user stories.</w:t>
+        <w:t>Designed and implemented new Odoo features by extending and modifying core functionalities using Python and XML, leading to a 20% increase in operational efficiency.</w:t>
       </w:r>
     </w:p>
     <w:p>
       <w:pPr>
         <w:pStyle w:val="ListParagraph"/>
-        <w:widowControl/>
         <w:numPr>
           <w:ilvl w:val="0"/>
-          <w:numId w:val="19"/>
+          <w:numId w:val="21"/>
         </w:numPr>
+        <w:tabs>
+          <w:tab w:val="right" w:pos="10800"/>
+        </w:tabs>
         <w:spacing w:before="20" w:after="20"/>
         <w:rPr>
           <w:lang w:val="en-AU" w:eastAsia="zh-CN"/>
@@ -529,75 +560,32 @@
         <w:rPr>
           <w:lang w:val="en-AU" w:eastAsia="zh-CN"/>
         </w:rPr>
-        <w:t>Configur</w:t>
+        <w:t>Collaborated with cross-functional teams to integrate the new application seamlessly with existing ERP systems</w:t>
       </w:r>
       <w:r>
         <w:rPr>
           <w:lang w:val="en-AU" w:eastAsia="zh-CN"/>
         </w:rPr>
-        <w:t>ing</w:t>
-      </w:r>
-      <w:r>
-        <w:rPr>
-          <w:lang w:val="en-AU" w:eastAsia="zh-CN"/>
-        </w:rPr>
-        <w:t xml:space="preserve"> and integrat</w:t>
-      </w:r>
-      <w:r>
-        <w:rPr>
-          <w:lang w:val="en-AU" w:eastAsia="zh-CN"/>
-        </w:rPr>
-        <w:t>ing</w:t>
-      </w:r>
-      <w:r>
-        <w:rPr>
-          <w:lang w:val="en-AU" w:eastAsia="zh-CN"/>
-        </w:rPr>
-        <w:t xml:space="preserve"> Odoo tools to improve communication, ticketing, marketing, and customer support.</w:t>
+        <w:t>.</w:t>
       </w:r>
     </w:p>
     <w:p>
       <w:pPr>
         <w:pStyle w:val="ListParagraph"/>
-        <w:widowControl/>
         <w:numPr>
           <w:ilvl w:val="0"/>
-          <w:numId w:val="19"/>
+          <w:numId w:val="21"/>
         </w:numPr>
+        <w:tabs>
+          <w:tab w:val="right" w:pos="10800"/>
+        </w:tabs>
         <w:spacing w:before="20" w:after="20"/>
+      </w:pPr>
+      <w:r>
         <w:rPr>
           <w:lang w:val="en-AU" w:eastAsia="zh-CN"/>
         </w:rPr>
-      </w:pPr>
-      <w:r>
-        <w:rPr>
-          <w:lang w:val="en-AU" w:eastAsia="zh-CN"/>
-        </w:rPr>
-        <w:t>Customiz</w:t>
-      </w:r>
-      <w:r>
-        <w:rPr>
-          <w:lang w:val="en-AU" w:eastAsia="zh-CN"/>
-        </w:rPr>
-        <w:t>ing</w:t>
-      </w:r>
-      <w:r>
-        <w:rPr>
-          <w:lang w:val="en-AU" w:eastAsia="zh-CN"/>
-        </w:rPr>
-        <w:t xml:space="preserve"> and updat</w:t>
-      </w:r>
-      <w:r>
-        <w:rPr>
-          <w:lang w:val="en-AU" w:eastAsia="zh-CN"/>
-        </w:rPr>
-        <w:t>ing</w:t>
-      </w:r>
-      <w:r>
-        <w:rPr>
-          <w:lang w:val="en-AU" w:eastAsia="zh-CN"/>
-        </w:rPr>
-        <w:t xml:space="preserve"> the Odoo POS system for efficient stock management and accurate pricing</w:t>
+        <w:t>Optimized Odoo website performance by refining Python code and SQL queries, resulting in a 25% improvement in load times and user experience.</w:t>
       </w:r>
     </w:p>
     <w:p>
@@ -944,33 +932,34 @@
         <w:spacing w:before="20" w:after="20"/>
         <w:rPr>
           <w:bCs/>
-        </w:rPr>
-      </w:pPr>
+          <w:sz w:val="24"/>
+          <w:szCs w:val="24"/>
+        </w:rPr>
+      </w:pPr>
+      <w:r>
+        <w:rPr>
+          <w:b/>
+          <w:bCs/>
+          <w:sz w:val="24"/>
+          <w:szCs w:val="24"/>
+        </w:rPr>
+        <w:t>Carina Eye Care Website Migration</w:t>
+      </w:r>
       <w:r>
         <w:rPr>
           <w:b/>
           <w:sz w:val="24"/>
           <w:szCs w:val="24"/>
         </w:rPr>
-        <w:t>Shortest Path Algorithm for Material Transportation</w:t>
-      </w:r>
-      <w:r>
-        <w:rPr>
-          <w:b/>
-        </w:rPr>
         <w:t xml:space="preserve">, </w:t>
       </w:r>
       <w:r>
         <w:rPr>
           <w:bCs/>
-        </w:rPr>
-        <w:t>Team of 7</w:t>
-      </w:r>
-      <w:r>
-        <w:rPr>
-          <w:bCs/>
-        </w:rPr>
-        <w:t>, Client: ATSYS</w:t>
+          <w:sz w:val="24"/>
+          <w:szCs w:val="24"/>
+        </w:rPr>
+        <w:t>Team of 3, Client: Carina Eye Care</w:t>
       </w:r>
     </w:p>
     <w:p>
@@ -989,7 +978,18 @@
         </w:rPr>
       </w:pPr>
       <w:r>
-        <w:t>Developed a SQL-based shortest path algorithm for optimized material transport, addressing inefficiencies in industrial logistics and boosting overall efficiency by 30%.</w:t>
+        <w:t>Led the migration of an outdated website to a modern platform to enhance user experience and maintainabilit</w:t>
+      </w:r>
+      <w:r>
+        <w:t xml:space="preserve">y using Next.js and </w:t>
+      </w:r>
+      <w:proofErr w:type="spellStart"/>
+      <w:r>
+        <w:t>TypeScirpt</w:t>
+      </w:r>
+      <w:proofErr w:type="spellEnd"/>
+      <w:r>
+        <w:t>.</w:t>
       </w:r>
     </w:p>
     <w:p>
@@ -1008,35 +1008,45 @@
         </w:rPr>
       </w:pPr>
       <w:r>
-        <w:t>Mapped factory layout into a graph using node tables and edge tables in MSSQL; documented and implemented SQL functions to compute five shortest paths using Neo4J.</w:t>
+        <w:t xml:space="preserve">Conducted meetings with the client to gather and document requirements, developed a technology proposal, and presented it for approval. </w:t>
       </w:r>
     </w:p>
     <w:p>
       <w:pPr>
-        <w:pStyle w:val="ListParagraph"/>
+        <w:pStyle w:val="NormalWeb"/>
         <w:numPr>
           <w:ilvl w:val="0"/>
           <w:numId w:val="14"/>
         </w:numPr>
-        <w:tabs>
-          <w:tab w:val="right" w:pos="10800"/>
-        </w:tabs>
-        <w:spacing w:before="20" w:after="20"/>
-        <w:rPr>
-          <w:bCs/>
-        </w:rPr>
-      </w:pPr>
-      <w:r>
-        <w:t>Achieved a 40% reduction in material transportation time through the application of the optimized shortest path</w:t>
-      </w:r>
-      <w:r>
-        <w:t xml:space="preserve"> </w:t>
-      </w:r>
-      <w:r>
-        <w:t>algorithm</w:t>
-      </w:r>
-      <w:r>
-        <w:t>.</w:t>
+      </w:pPr>
+      <w:r>
+        <w:t xml:space="preserve">Organized and assigned tasks to team members, tracked project progress, and facilitated weekly retrospective meetings with the client to ensure alignment. </w:t>
+      </w:r>
+    </w:p>
+    <w:p>
+      <w:pPr>
+        <w:pStyle w:val="NormalWeb"/>
+        <w:numPr>
+          <w:ilvl w:val="0"/>
+          <w:numId w:val="14"/>
+        </w:numPr>
+      </w:pPr>
+      <w:r>
+        <w:rPr>
+          <w:rStyle w:val="Strong"/>
+        </w:rPr>
+        <w:t>Technologies Used:</w:t>
+      </w:r>
+      <w:r>
+        <w:t xml:space="preserve"> Next.js, </w:t>
+      </w:r>
+      <w:proofErr w:type="spellStart"/>
+      <w:r>
+        <w:t>Storyblok</w:t>
+      </w:r>
+      <w:proofErr w:type="spellEnd"/>
+      <w:r>
+        <w:t xml:space="preserve"> (Headless CMS), TypeScript</w:t>
       </w:r>
     </w:p>
     <w:p>
@@ -1077,10 +1087,78 @@
       <w:r>
         <w:rPr>
           <w:rFonts w:eastAsiaTheme="minorEastAsia"/>
+          <w:b/>
+          <w:bCs/>
           <w:color w:val="000000" w:themeColor="text1"/>
           <w:lang w:val="en-GB"/>
         </w:rPr>
-        <w:t>Python, C, C++, HTML5, CSS, JavaScript, Nodejs, SQL, MySQL, MSSQL.</w:t>
+        <w:t>Language</w:t>
+      </w:r>
+      <w:r>
+        <w:rPr>
+          <w:rFonts w:eastAsiaTheme="minorEastAsia"/>
+          <w:b/>
+          <w:bCs/>
+          <w:color w:val="000000" w:themeColor="text1"/>
+          <w:lang w:val="en-GB"/>
+        </w:rPr>
+        <w:t>s</w:t>
+      </w:r>
+      <w:r>
+        <w:rPr>
+          <w:rFonts w:eastAsiaTheme="minorEastAsia"/>
+          <w:color w:val="000000" w:themeColor="text1"/>
+          <w:lang w:val="en-GB"/>
+        </w:rPr>
+        <w:t xml:space="preserve">: </w:t>
+      </w:r>
+      <w:r>
+        <w:rPr>
+          <w:rFonts w:eastAsiaTheme="minorEastAsia"/>
+          <w:color w:val="000000" w:themeColor="text1"/>
+          <w:lang w:val="en-GB"/>
+        </w:rPr>
+        <w:t>Python, C, C++</w:t>
+      </w:r>
+      <w:r>
+        <w:rPr>
+          <w:rFonts w:eastAsiaTheme="minorEastAsia"/>
+          <w:color w:val="000000" w:themeColor="text1"/>
+          <w:lang w:val="en-GB"/>
+        </w:rPr>
+        <w:t>, C#</w:t>
+      </w:r>
+      <w:r>
+        <w:rPr>
+          <w:rFonts w:eastAsiaTheme="minorEastAsia"/>
+          <w:color w:val="000000" w:themeColor="text1"/>
+          <w:lang w:val="en-GB"/>
+        </w:rPr>
+        <w:t>, HTML5, CSS,</w:t>
+      </w:r>
+      <w:r>
+        <w:rPr>
+          <w:rFonts w:eastAsiaTheme="minorEastAsia"/>
+          <w:color w:val="000000" w:themeColor="text1"/>
+          <w:lang w:val="en-GB"/>
+        </w:rPr>
+        <w:t xml:space="preserve"> </w:t>
+      </w:r>
+      <w:r>
+        <w:rPr>
+          <w:rFonts w:eastAsiaTheme="minorEastAsia"/>
+          <w:color w:val="000000" w:themeColor="text1"/>
+          <w:lang w:val="en-GB"/>
+        </w:rPr>
+        <w:t>JavaScript</w:t>
+      </w:r>
+      <w:r>
+        <w:rPr>
+          <w:rFonts w:eastAsiaTheme="minorEastAsia"/>
+          <w:color w:val="000000" w:themeColor="text1"/>
+          <w:lang w:val="en-GB"/>
+        </w:rPr>
+        <w:t xml:space="preserve"> </w:t>
       </w:r>
     </w:p>
     <w:p>
@@ -1094,33 +1172,63 @@
           <w:tab w:val="left" w:pos="279"/>
         </w:tabs>
         <w:spacing w:before="20" w:after="20"/>
-        <w:rPr>
-          <w:lang w:val="vi-VN"/>
-        </w:rPr>
-      </w:pPr>
-      <w:r>
-        <w:rPr>
-          <w:lang w:val="en-AU"/>
-        </w:rPr>
-        <w:t xml:space="preserve">Microsoft Office (Word, Excel, PowerPoint), Python (pandas, </w:t>
-      </w:r>
-      <w:r>
-        <w:rPr>
-          <w:lang w:val="en-AU"/>
-        </w:rPr>
-        <w:t>NumPy</w:t>
-      </w:r>
-      <w:r>
-        <w:rPr>
-          <w:lang w:val="en-AU"/>
-        </w:rPr>
-        <w:t>)</w:t>
-      </w:r>
-      <w:r>
-        <w:rPr>
-          <w:lang w:val="en-AU"/>
-        </w:rPr>
-        <w:t>, Docker</w:t>
+      </w:pPr>
+      <w:r>
+        <w:rPr>
+          <w:rFonts w:eastAsiaTheme="minorEastAsia"/>
+          <w:b/>
+          <w:bCs/>
+          <w:color w:val="000000" w:themeColor="text1"/>
+        </w:rPr>
+        <w:t>Framework</w:t>
+      </w:r>
+      <w:r>
+        <w:rPr>
+          <w:rFonts w:eastAsiaTheme="minorEastAsia"/>
+          <w:b/>
+          <w:bCs/>
+          <w:color w:val="000000" w:themeColor="text1"/>
+        </w:rPr>
+        <w:t>s</w:t>
+      </w:r>
+      <w:r>
+        <w:rPr>
+          <w:rFonts w:eastAsiaTheme="minorEastAsia"/>
+          <w:color w:val="000000" w:themeColor="text1"/>
+        </w:rPr>
+        <w:t xml:space="preserve">: </w:t>
+      </w:r>
+      <w:r>
+        <w:rPr>
+          <w:rFonts w:eastAsiaTheme="minorEastAsia"/>
+          <w:color w:val="000000" w:themeColor="text1"/>
+          <w:lang w:val="en-GB"/>
+        </w:rPr>
+        <w:t>Node</w:t>
+      </w:r>
+      <w:r>
+        <w:rPr>
+          <w:rFonts w:eastAsiaTheme="minorEastAsia"/>
+          <w:color w:val="000000" w:themeColor="text1"/>
+          <w:lang w:val="en-GB"/>
+        </w:rPr>
+        <w:t>J</w:t>
+      </w:r>
+      <w:r>
+        <w:rPr>
+          <w:rFonts w:eastAsiaTheme="minorEastAsia"/>
+          <w:color w:val="000000" w:themeColor="text1"/>
+          <w:lang w:val="en-GB"/>
+        </w:rPr>
+        <w:t>S</w:t>
+      </w:r>
+      <w:r>
+        <w:rPr>
+          <w:rFonts w:eastAsiaTheme="minorEastAsia"/>
+          <w:color w:val="000000" w:themeColor="text1"/>
+          <w:lang w:val="en-GB"/>
+        </w:rPr>
+        <w:t>, ReactJs, Angular</w:t>
       </w:r>
     </w:p>
     <w:p>
@@ -1134,15 +1242,21 @@
           <w:tab w:val="left" w:pos="279"/>
         </w:tabs>
         <w:spacing w:before="20" w:after="20"/>
-        <w:rPr>
-          <w:lang w:val="vi-VN"/>
-        </w:rPr>
-      </w:pPr>
-      <w:r>
-        <w:rPr>
-          <w:lang w:val="en-AU"/>
-        </w:rPr>
-        <w:t>Asana, GitHub, Jira</w:t>
+      </w:pPr>
+      <w:r>
+        <w:rPr>
+          <w:rFonts w:eastAsiaTheme="minorEastAsia"/>
+          <w:b/>
+          <w:bCs/>
+          <w:color w:val="000000" w:themeColor="text1"/>
+        </w:rPr>
+        <w:t>Platform</w:t>
+      </w:r>
+      <w:r>
+        <w:t>:</w:t>
+      </w:r>
+      <w:r>
+        <w:t xml:space="preserve"> Window, Mac, Linux</w:t>
       </w:r>
     </w:p>
     <w:p>
@@ -1159,9 +1273,27 @@
       </w:pPr>
       <w:r>
         <w:rPr>
-          <w:lang w:val="en-AU"/>
-        </w:rPr>
-        <w:t>Odoo, POS System</w:t>
+          <w:rFonts w:eastAsiaTheme="minorEastAsia"/>
+          <w:b/>
+          <w:bCs/>
+          <w:color w:val="000000" w:themeColor="text1"/>
+        </w:rPr>
+        <w:t>Database</w:t>
+      </w:r>
+      <w:r>
+        <w:rPr>
+          <w:rFonts w:eastAsiaTheme="minorEastAsia"/>
+          <w:color w:val="000000" w:themeColor="text1"/>
+        </w:rPr>
+        <w:t xml:space="preserve">: </w:t>
+      </w:r>
+      <w:r>
+        <w:rPr>
+          <w:rFonts w:eastAsiaTheme="minorEastAsia"/>
+          <w:color w:val="000000" w:themeColor="text1"/>
+          <w:lang w:val="en-GB"/>
+        </w:rPr>
+        <w:t>SQL, MySQL, MSSQL.</w:t>
       </w:r>
     </w:p>
     <w:p>
@@ -1178,44 +1310,59 @@
       </w:pPr>
       <w:r>
         <w:rPr>
-          <w:lang w:val="en-AU"/>
-        </w:rPr>
-        <w:t>Vietnamese, English</w:t>
-      </w:r>
-      <w:bookmarkStart w:id="1" w:name="_h2v56et7ofq0" w:colFirst="0" w:colLast="0"/>
-      <w:bookmarkEnd w:id="1"/>
-      <w:r>
-        <w:tab/>
+          <w:rFonts w:eastAsiaTheme="minorEastAsia"/>
+          <w:b/>
+          <w:bCs/>
+          <w:color w:val="000000" w:themeColor="text1"/>
+          <w:lang w:val="en-GB"/>
+        </w:rPr>
+        <w:t>Tools</w:t>
+      </w:r>
+      <w:r>
+        <w:rPr>
+          <w:rFonts w:eastAsiaTheme="minorEastAsia"/>
+          <w:color w:val="000000" w:themeColor="text1"/>
+          <w:lang w:val="en-GB"/>
+        </w:rPr>
+        <w:t>: AWS, Docker, GitHub, Asana, Postman</w:t>
       </w:r>
     </w:p>
     <w:p>
       <w:pPr>
+        <w:pStyle w:val="ListParagraph"/>
+        <w:numPr>
+          <w:ilvl w:val="0"/>
+          <w:numId w:val="16"/>
+        </w:numPr>
         <w:tabs>
           <w:tab w:val="left" w:pos="279"/>
         </w:tabs>
         <w:spacing w:before="20" w:after="20"/>
       </w:pPr>
+      <w:r>
+        <w:rPr>
+          <w:b/>
+          <w:bCs/>
+          <w:lang w:val="en-AU"/>
+        </w:rPr>
+        <w:t>ERP</w:t>
+      </w:r>
+      <w:r>
+        <w:rPr>
+          <w:lang w:val="en-AU"/>
+        </w:rPr>
+        <w:t xml:space="preserve">: </w:t>
+      </w:r>
+      <w:r>
+        <w:rPr>
+          <w:lang w:val="en-AU"/>
+        </w:rPr>
+        <w:t>Odoo</w:t>
+      </w:r>
+      <w:bookmarkStart w:id="1" w:name="_h2v56et7ofq0" w:colFirst="0" w:colLast="0"/>
       <w:bookmarkStart w:id="2" w:name="_rw5lhlyzszgh" w:colFirst="0" w:colLast="0"/>
+      <w:bookmarkEnd w:id="1"/>
       <w:bookmarkEnd w:id="2"/>
-    </w:p>
-    <w:p>
-      <w:pPr>
-        <w:pBdr>
-          <w:between w:val="single" w:sz="4" w:space="1" w:color="auto"/>
-        </w:pBdr>
-        <w:tabs>
-          <w:tab w:val="left" w:pos="279"/>
-        </w:tabs>
-        <w:spacing w:before="20" w:after="20"/>
-      </w:pPr>
-    </w:p>
-    <w:p>
-      <w:pPr>
-        <w:tabs>
-          <w:tab w:val="left" w:pos="279"/>
-        </w:tabs>
-        <w:spacing w:before="20" w:after="20"/>
-      </w:pPr>
     </w:p>
     <w:sectPr>
       <w:type w:val="continuous"/>
@@ -1227,6 +1374,44 @@
 </w:document>
 </file>
 
+<file path=word/endnotes.xml><?xml version="1.0" encoding="utf-8"?>
+<w:endnotes xmlns:wpc="http://schemas.microsoft.com/office/word/2010/wordprocessingCanvas" xmlns:cx="http://schemas.microsoft.com/office/drawing/2014/chartex" xmlns:cx1="http://schemas.microsoft.com/office/drawing/2015/9/8/chartex" xmlns:cx2="http://schemas.microsoft.com/office/drawing/2015/10/21/chartex" xmlns:cx3="http://schemas.microsoft.com/office/drawing/2016/5/9/chartex" xmlns:cx4="http://schemas.microsoft.com/office/drawing/2016/5/10/chartex" xmlns:cx5="http://schemas.microsoft.com/office/drawing/2016/5/11/chartex" xmlns:cx6="http://schemas.microsoft.com/office/drawing/2016/5/12/chartex" xmlns:cx7="http://schemas.microsoft.com/office/drawing/2016/5/13/chartex" xmlns:cx8="http://schemas.microsoft.com/office/drawing/2016/5/14/chartex" xmlns:mc="http://schemas.openxmlformats.org/markup-compatibility/2006" xmlns:aink="http://schemas.microsoft.com/office/drawing/2016/ink" xmlns:am3d="http://schemas.microsoft.com/office/drawing/2017/model3d" xmlns:o="urn:schemas-microsoft-com:office:office" xmlns:oel="http://schemas.microsoft.com/office/2019/extlst" xmlns:r="http://schemas.openxmlformats.org/officeDocument/2006/relationships" xmlns:m="http://schemas.openxmlformats.org/officeDocument/2006/math" xmlns:v="urn:schemas-microsoft-com:vml" xmlns:wp14="http://schemas.microsoft.com/office/word/2010/wordprocessingDrawing" xmlns:wp="http://schemas.openxmlformats.org/drawingml/2006/wordprocessingDrawing" xmlns:w10="urn:schemas-microsoft-com:office:word" xmlns:w="http://schemas.openxmlformats.org/wordprocessingml/2006/main" xmlns:w14="http://schemas.microsoft.com/office/word/2010/wordml" xmlns:w15="http://schemas.microsoft.com/office/word/2012/wordml" xmlns:w16cex="http://schemas.microsoft.com/office/word/2018/wordml/cex" xmlns:w16cid="http://schemas.microsoft.com/office/word/2016/wordml/cid" xmlns:w16="http://schemas.microsoft.com/office/word/2018/wordml" xmlns:w16du="http://schemas.microsoft.com/office/word/2023/wordml/word16du" xmlns:w16sdtdh="http://schemas.microsoft.com/office/word/2020/wordml/sdtdatahash" xmlns:w16se="http://schemas.microsoft.com/office/word/2015/wordml/symex" xmlns:wpg="http://schemas.microsoft.com/office/word/2010/wordprocessingGroup" xmlns:wpi="http://schemas.microsoft.com/office/word/2010/wordprocessingInk" xmlns:wne="http://schemas.microsoft.com/office/word/2006/wordml" xmlns:wps="http://schemas.microsoft.com/office/word/2010/wordprocessingShape" mc:Ignorable="w14 w15 w16se w16cid w16 w16cex w16sdtdh w16du wp14">
+  <w:endnote w:type="separator" w:id="-1">
+    <w:p>
+      <w:r>
+        <w:separator/>
+      </w:r>
+    </w:p>
+  </w:endnote>
+  <w:endnote w:type="continuationSeparator" w:id="0">
+    <w:p>
+      <w:r>
+        <w:continuationSeparator/>
+      </w:r>
+    </w:p>
+  </w:endnote>
+</w:endnotes>
+</file>
+
+<file path=word/footnotes.xml><?xml version="1.0" encoding="utf-8"?>
+<w:footnotes xmlns:wpc="http://schemas.microsoft.com/office/word/2010/wordprocessingCanvas" xmlns:cx="http://schemas.microsoft.com/office/drawing/2014/chartex" xmlns:cx1="http://schemas.microsoft.com/office/drawing/2015/9/8/chartex" xmlns:cx2="http://schemas.microsoft.com/office/drawing/2015/10/21/chartex" xmlns:cx3="http://schemas.microsoft.com/office/drawing/2016/5/9/chartex" xmlns:cx4="http://schemas.microsoft.com/office/drawing/2016/5/10/chartex" xmlns:cx5="http://schemas.microsoft.com/office/drawing/2016/5/11/chartex" xmlns:cx6="http://schemas.microsoft.com/office/drawing/2016/5/12/chartex" xmlns:cx7="http://schemas.microsoft.com/office/drawing/2016/5/13/chartex" xmlns:cx8="http://schemas.microsoft.com/office/drawing/2016/5/14/chartex" xmlns:mc="http://schemas.openxmlformats.org/markup-compatibility/2006" xmlns:aink="http://schemas.microsoft.com/office/drawing/2016/ink" xmlns:am3d="http://schemas.microsoft.com/office/drawing/2017/model3d" xmlns:o="urn:schemas-microsoft-com:office:office" xmlns:oel="http://schemas.microsoft.com/office/2019/extlst" xmlns:r="http://schemas.openxmlformats.org/officeDocument/2006/relationships" xmlns:m="http://schemas.openxmlformats.org/officeDocument/2006/math" xmlns:v="urn:schemas-microsoft-com:vml" xmlns:wp14="http://schemas.microsoft.com/office/word/2010/wordprocessingDrawing" xmlns:wp="http://schemas.openxmlformats.org/drawingml/2006/wordprocessingDrawing" xmlns:w10="urn:schemas-microsoft-com:office:word" xmlns:w="http://schemas.openxmlformats.org/wordprocessingml/2006/main" xmlns:w14="http://schemas.microsoft.com/office/word/2010/wordml" xmlns:w15="http://schemas.microsoft.com/office/word/2012/wordml" xmlns:w16cex="http://schemas.microsoft.com/office/word/2018/wordml/cex" xmlns:w16cid="http://schemas.microsoft.com/office/word/2016/wordml/cid" xmlns:w16="http://schemas.microsoft.com/office/word/2018/wordml" xmlns:w16du="http://schemas.microsoft.com/office/word/2023/wordml/word16du" xmlns:w16sdtdh="http://schemas.microsoft.com/office/word/2020/wordml/sdtdatahash" xmlns:w16se="http://schemas.microsoft.com/office/word/2015/wordml/symex" xmlns:wpg="http://schemas.microsoft.com/office/word/2010/wordprocessingGroup" xmlns:wpi="http://schemas.microsoft.com/office/word/2010/wordprocessingInk" xmlns:wne="http://schemas.microsoft.com/office/word/2006/wordml" xmlns:wps="http://schemas.microsoft.com/office/word/2010/wordprocessingShape" mc:Ignorable="w14 w15 w16se w16cid w16 w16cex w16sdtdh w16du wp14">
+  <w:footnote w:type="separator" w:id="-1">
+    <w:p>
+      <w:r>
+        <w:separator/>
+      </w:r>
+    </w:p>
+  </w:footnote>
+  <w:footnote w:type="continuationSeparator" w:id="0">
+    <w:p>
+      <w:r>
+        <w:continuationSeparator/>
+      </w:r>
+    </w:p>
+  </w:footnote>
+</w:footnotes>
+</file>
+
 <file path=word/numbering.xml><?xml version="1.0" encoding="utf-8"?>
 <w:numbering xmlns:wpc="http://schemas.microsoft.com/office/word/2010/wordprocessingCanvas" xmlns:cx="http://schemas.microsoft.com/office/drawing/2014/chartex" xmlns:cx1="http://schemas.microsoft.com/office/drawing/2015/9/8/chartex" xmlns:cx2="http://schemas.microsoft.com/office/drawing/2015/10/21/chartex" xmlns:cx3="http://schemas.microsoft.com/office/drawing/2016/5/9/chartex" xmlns:cx4="http://schemas.microsoft.com/office/drawing/2016/5/10/chartex" xmlns:cx5="http://schemas.microsoft.com/office/drawing/2016/5/11/chartex" xmlns:cx6="http://schemas.microsoft.com/office/drawing/2016/5/12/chartex" xmlns:cx7="http://schemas.microsoft.com/office/drawing/2016/5/13/chartex" xmlns:cx8="http://schemas.microsoft.com/office/drawing/2016/5/14/chartex" xmlns:mc="http://schemas.openxmlformats.org/markup-compatibility/2006" xmlns:aink="http://schemas.microsoft.com/office/drawing/2016/ink" xmlns:am3d="http://schemas.microsoft.com/office/drawing/2017/model3d" xmlns:o="urn:schemas-microsoft-com:office:office" xmlns:oel="http://schemas.microsoft.com/office/2019/extlst" xmlns:r="http://schemas.openxmlformats.org/officeDocument/2006/relationships" xmlns:m="http://schemas.openxmlformats.org/officeDocument/2006/math" xmlns:v="urn:schemas-microsoft-com:vml" xmlns:wp14="http://schemas.microsoft.com/office/word/2010/wordprocessingDrawing" xmlns:wp="http://schemas.openxmlformats.org/drawingml/2006/wordprocessingDrawing" xmlns:w10="urn:schemas-microsoft-com:office:word" xmlns:w="http://schemas.openxmlformats.org/wordprocessingml/2006/main" xmlns:w14="http://schemas.microsoft.com/office/word/2010/wordml" xmlns:w15="http://schemas.microsoft.com/office/word/2012/wordml" xmlns:w16cex="http://schemas.microsoft.com/office/word/2018/wordml/cex" xmlns:w16cid="http://schemas.microsoft.com/office/word/2016/wordml/cid" xmlns:w16="http://schemas.microsoft.com/office/word/2018/wordml" xmlns:w16du="http://schemas.microsoft.com/office/word/2023/wordml/word16du" xmlns:w16sdtdh="http://schemas.microsoft.com/office/word/2020/wordml/sdtdatahash" xmlns:w16se="http://schemas.microsoft.com/office/word/2015/wordml/symex" xmlns:wpg="http://schemas.microsoft.com/office/word/2010/wordprocessingGroup" xmlns:wpi="http://schemas.microsoft.com/office/word/2010/wordprocessingInk" xmlns:wne="http://schemas.microsoft.com/office/word/2006/wordml" xmlns:wps="http://schemas.microsoft.com/office/word/2010/wordprocessingShape" mc:Ignorable="w14 w15 w16se w16cid w16 w16cex w16sdtdh w16du wp14">
   <w:abstractNum w:abstractNumId="0" w15:restartNumberingAfterBreak="0">
@@ -1343,6 +1528,268 @@
     </w:lvl>
   </w:abstractNum>
   <w:abstractNum w:abstractNumId="1" w15:restartNumberingAfterBreak="0">
+    <w:nsid w:val="114960C2"/>
+    <w:multiLevelType w:val="hybridMultilevel"/>
+    <w:tmpl w:val="89609B94"/>
+    <w:lvl w:ilvl="0" w:tplc="08090001">
+      <w:start w:val="1"/>
+      <w:numFmt w:val="bullet"/>
+      <w:lvlText w:val=""/>
+      <w:lvlJc w:val="left"/>
+      <w:pPr>
+        <w:ind w:left="720" w:hanging="360"/>
+      </w:pPr>
+      <w:rPr>
+        <w:rFonts w:ascii="Symbol" w:hAnsi="Symbol" w:hint="default"/>
+      </w:rPr>
+    </w:lvl>
+    <w:lvl w:ilvl="1" w:tplc="08090003" w:tentative="1">
+      <w:start w:val="1"/>
+      <w:numFmt w:val="bullet"/>
+      <w:lvlText w:val="o"/>
+      <w:lvlJc w:val="left"/>
+      <w:pPr>
+        <w:ind w:left="1440" w:hanging="360"/>
+      </w:pPr>
+      <w:rPr>
+        <w:rFonts w:ascii="Courier New" w:hAnsi="Courier New" w:cs="Courier New" w:hint="default"/>
+      </w:rPr>
+    </w:lvl>
+    <w:lvl w:ilvl="2" w:tplc="08090005" w:tentative="1">
+      <w:start w:val="1"/>
+      <w:numFmt w:val="bullet"/>
+      <w:lvlText w:val=""/>
+      <w:lvlJc w:val="left"/>
+      <w:pPr>
+        <w:ind w:left="2160" w:hanging="360"/>
+      </w:pPr>
+      <w:rPr>
+        <w:rFonts w:ascii="Wingdings" w:hAnsi="Wingdings" w:hint="default"/>
+      </w:rPr>
+    </w:lvl>
+    <w:lvl w:ilvl="3" w:tplc="08090001" w:tentative="1">
+      <w:start w:val="1"/>
+      <w:numFmt w:val="bullet"/>
+      <w:lvlText w:val=""/>
+      <w:lvlJc w:val="left"/>
+      <w:pPr>
+        <w:ind w:left="2880" w:hanging="360"/>
+      </w:pPr>
+      <w:rPr>
+        <w:rFonts w:ascii="Symbol" w:hAnsi="Symbol" w:hint="default"/>
+      </w:rPr>
+    </w:lvl>
+    <w:lvl w:ilvl="4" w:tplc="08090003" w:tentative="1">
+      <w:start w:val="1"/>
+      <w:numFmt w:val="bullet"/>
+      <w:lvlText w:val="o"/>
+      <w:lvlJc w:val="left"/>
+      <w:pPr>
+        <w:ind w:left="3600" w:hanging="360"/>
+      </w:pPr>
+      <w:rPr>
+        <w:rFonts w:ascii="Courier New" w:hAnsi="Courier New" w:cs="Courier New" w:hint="default"/>
+      </w:rPr>
+    </w:lvl>
+    <w:lvl w:ilvl="5" w:tplc="08090005" w:tentative="1">
+      <w:start w:val="1"/>
+      <w:numFmt w:val="bullet"/>
+      <w:lvlText w:val=""/>
+      <w:lvlJc w:val="left"/>
+      <w:pPr>
+        <w:ind w:left="4320" w:hanging="360"/>
+      </w:pPr>
+      <w:rPr>
+        <w:rFonts w:ascii="Wingdings" w:hAnsi="Wingdings" w:hint="default"/>
+      </w:rPr>
+    </w:lvl>
+    <w:lvl w:ilvl="6" w:tplc="08090001" w:tentative="1">
+      <w:start w:val="1"/>
+      <w:numFmt w:val="bullet"/>
+      <w:lvlText w:val=""/>
+      <w:lvlJc w:val="left"/>
+      <w:pPr>
+        <w:ind w:left="5040" w:hanging="360"/>
+      </w:pPr>
+      <w:rPr>
+        <w:rFonts w:ascii="Symbol" w:hAnsi="Symbol" w:hint="default"/>
+      </w:rPr>
+    </w:lvl>
+    <w:lvl w:ilvl="7" w:tplc="08090003" w:tentative="1">
+      <w:start w:val="1"/>
+      <w:numFmt w:val="bullet"/>
+      <w:lvlText w:val="o"/>
+      <w:lvlJc w:val="left"/>
+      <w:pPr>
+        <w:ind w:left="5760" w:hanging="360"/>
+      </w:pPr>
+      <w:rPr>
+        <w:rFonts w:ascii="Courier New" w:hAnsi="Courier New" w:cs="Courier New" w:hint="default"/>
+      </w:rPr>
+    </w:lvl>
+    <w:lvl w:ilvl="8" w:tplc="08090005" w:tentative="1">
+      <w:start w:val="1"/>
+      <w:numFmt w:val="bullet"/>
+      <w:lvlText w:val=""/>
+      <w:lvlJc w:val="left"/>
+      <w:pPr>
+        <w:ind w:left="6480" w:hanging="360"/>
+      </w:pPr>
+      <w:rPr>
+        <w:rFonts w:ascii="Wingdings" w:hAnsi="Wingdings" w:hint="default"/>
+      </w:rPr>
+    </w:lvl>
+  </w:abstractNum>
+  <w:abstractNum w:abstractNumId="2" w15:restartNumberingAfterBreak="0">
+    <w:nsid w:val="1AB55246"/>
+    <w:multiLevelType w:val="multilevel"/>
+    <w:tmpl w:val="221CFD5C"/>
+    <w:lvl w:ilvl="0">
+      <w:start w:val="1"/>
+      <w:numFmt w:val="bullet"/>
+      <w:lvlText w:val=""/>
+      <w:lvlJc w:val="left"/>
+      <w:pPr>
+        <w:tabs>
+          <w:tab w:val="num" w:pos="720"/>
+        </w:tabs>
+        <w:ind w:left="720" w:hanging="360"/>
+      </w:pPr>
+      <w:rPr>
+        <w:rFonts w:ascii="Symbol" w:hAnsi="Symbol" w:hint="default"/>
+        <w:sz w:val="20"/>
+      </w:rPr>
+    </w:lvl>
+    <w:lvl w:ilvl="1" w:tentative="1">
+      <w:start w:val="1"/>
+      <w:numFmt w:val="bullet"/>
+      <w:lvlText w:val="o"/>
+      <w:lvlJc w:val="left"/>
+      <w:pPr>
+        <w:tabs>
+          <w:tab w:val="num" w:pos="1440"/>
+        </w:tabs>
+        <w:ind w:left="1440" w:hanging="360"/>
+      </w:pPr>
+      <w:rPr>
+        <w:rFonts w:ascii="Courier New" w:hAnsi="Courier New" w:hint="default"/>
+        <w:sz w:val="20"/>
+      </w:rPr>
+    </w:lvl>
+    <w:lvl w:ilvl="2" w:tentative="1">
+      <w:start w:val="1"/>
+      <w:numFmt w:val="bullet"/>
+      <w:lvlText w:val=""/>
+      <w:lvlJc w:val="left"/>
+      <w:pPr>
+        <w:tabs>
+          <w:tab w:val="num" w:pos="2160"/>
+        </w:tabs>
+        <w:ind w:left="2160" w:hanging="360"/>
+      </w:pPr>
+      <w:rPr>
+        <w:rFonts w:ascii="Wingdings" w:hAnsi="Wingdings" w:hint="default"/>
+        <w:sz w:val="20"/>
+      </w:rPr>
+    </w:lvl>
+    <w:lvl w:ilvl="3" w:tentative="1">
+      <w:start w:val="1"/>
+      <w:numFmt w:val="bullet"/>
+      <w:lvlText w:val=""/>
+      <w:lvlJc w:val="left"/>
+      <w:pPr>
+        <w:tabs>
+          <w:tab w:val="num" w:pos="2880"/>
+        </w:tabs>
+        <w:ind w:left="2880" w:hanging="360"/>
+      </w:pPr>
+      <w:rPr>
+        <w:rFonts w:ascii="Wingdings" w:hAnsi="Wingdings" w:hint="default"/>
+        <w:sz w:val="20"/>
+      </w:rPr>
+    </w:lvl>
+    <w:lvl w:ilvl="4" w:tentative="1">
+      <w:start w:val="1"/>
+      <w:numFmt w:val="bullet"/>
+      <w:lvlText w:val=""/>
+      <w:lvlJc w:val="left"/>
+      <w:pPr>
+        <w:tabs>
+          <w:tab w:val="num" w:pos="3600"/>
+        </w:tabs>
+        <w:ind w:left="3600" w:hanging="360"/>
+      </w:pPr>
+      <w:rPr>
+        <w:rFonts w:ascii="Wingdings" w:hAnsi="Wingdings" w:hint="default"/>
+        <w:sz w:val="20"/>
+      </w:rPr>
+    </w:lvl>
+    <w:lvl w:ilvl="5" w:tentative="1">
+      <w:start w:val="1"/>
+      <w:numFmt w:val="bullet"/>
+      <w:lvlText w:val=""/>
+      <w:lvlJc w:val="left"/>
+      <w:pPr>
+        <w:tabs>
+          <w:tab w:val="num" w:pos="4320"/>
+        </w:tabs>
+        <w:ind w:left="4320" w:hanging="360"/>
+      </w:pPr>
+      <w:rPr>
+        <w:rFonts w:ascii="Wingdings" w:hAnsi="Wingdings" w:hint="default"/>
+        <w:sz w:val="20"/>
+      </w:rPr>
+    </w:lvl>
+    <w:lvl w:ilvl="6" w:tentative="1">
+      <w:start w:val="1"/>
+      <w:numFmt w:val="bullet"/>
+      <w:lvlText w:val=""/>
+      <w:lvlJc w:val="left"/>
+      <w:pPr>
+        <w:tabs>
+          <w:tab w:val="num" w:pos="5040"/>
+        </w:tabs>
+        <w:ind w:left="5040" w:hanging="360"/>
+      </w:pPr>
+      <w:rPr>
+        <w:rFonts w:ascii="Wingdings" w:hAnsi="Wingdings" w:hint="default"/>
+        <w:sz w:val="20"/>
+      </w:rPr>
+    </w:lvl>
+    <w:lvl w:ilvl="7" w:tentative="1">
+      <w:start w:val="1"/>
+      <w:numFmt w:val="bullet"/>
+      <w:lvlText w:val=""/>
+      <w:lvlJc w:val="left"/>
+      <w:pPr>
+        <w:tabs>
+          <w:tab w:val="num" w:pos="5760"/>
+        </w:tabs>
+        <w:ind w:left="5760" w:hanging="360"/>
+      </w:pPr>
+      <w:rPr>
+        <w:rFonts w:ascii="Wingdings" w:hAnsi="Wingdings" w:hint="default"/>
+        <w:sz w:val="20"/>
+      </w:rPr>
+    </w:lvl>
+    <w:lvl w:ilvl="8" w:tentative="1">
+      <w:start w:val="1"/>
+      <w:numFmt w:val="bullet"/>
+      <w:lvlText w:val=""/>
+      <w:lvlJc w:val="left"/>
+      <w:pPr>
+        <w:tabs>
+          <w:tab w:val="num" w:pos="6480"/>
+        </w:tabs>
+        <w:ind w:left="6480" w:hanging="360"/>
+      </w:pPr>
+      <w:rPr>
+        <w:rFonts w:ascii="Wingdings" w:hAnsi="Wingdings" w:hint="default"/>
+        <w:sz w:val="20"/>
+      </w:rPr>
+    </w:lvl>
+  </w:abstractNum>
+  <w:abstractNum w:abstractNumId="3" w15:restartNumberingAfterBreak="0">
     <w:nsid w:val="1B0A0F3B"/>
     <w:multiLevelType w:val="hybridMultilevel"/>
     <w:tmpl w:val="24D2F68C"/>
@@ -1455,7 +1902,7 @@
       </w:rPr>
     </w:lvl>
   </w:abstractNum>
-  <w:abstractNum w:abstractNumId="2" w15:restartNumberingAfterBreak="0">
+  <w:abstractNum w:abstractNumId="4" w15:restartNumberingAfterBreak="0">
     <w:nsid w:val="1EC5318A"/>
     <w:multiLevelType w:val="hybridMultilevel"/>
     <w:tmpl w:val="6C405AFE"/>
@@ -1568,7 +2015,7 @@
       </w:rPr>
     </w:lvl>
   </w:abstractNum>
-  <w:abstractNum w:abstractNumId="3" w15:restartNumberingAfterBreak="0">
+  <w:abstractNum w:abstractNumId="5" w15:restartNumberingAfterBreak="0">
     <w:nsid w:val="2B242FEF"/>
     <w:multiLevelType w:val="hybridMultilevel"/>
     <w:tmpl w:val="26D295DC"/>
@@ -1681,7 +2128,7 @@
       </w:rPr>
     </w:lvl>
   </w:abstractNum>
-  <w:abstractNum w:abstractNumId="4" w15:restartNumberingAfterBreak="0">
+  <w:abstractNum w:abstractNumId="6" w15:restartNumberingAfterBreak="0">
     <w:nsid w:val="31AF4C7F"/>
     <w:multiLevelType w:val="hybridMultilevel"/>
     <w:tmpl w:val="D63C621C"/>
@@ -1794,7 +2241,7 @@
       </w:rPr>
     </w:lvl>
   </w:abstractNum>
-  <w:abstractNum w:abstractNumId="5" w15:restartNumberingAfterBreak="0">
+  <w:abstractNum w:abstractNumId="7" w15:restartNumberingAfterBreak="0">
     <w:nsid w:val="35897461"/>
     <w:multiLevelType w:val="hybridMultilevel"/>
     <w:tmpl w:val="C874B21E"/>
@@ -1907,7 +2354,120 @@
       </w:rPr>
     </w:lvl>
   </w:abstractNum>
-  <w:abstractNum w:abstractNumId="6" w15:restartNumberingAfterBreak="0">
+  <w:abstractNum w:abstractNumId="8" w15:restartNumberingAfterBreak="0">
+    <w:nsid w:val="37433B57"/>
+    <w:multiLevelType w:val="hybridMultilevel"/>
+    <w:tmpl w:val="702CE446"/>
+    <w:lvl w:ilvl="0" w:tplc="08090001">
+      <w:start w:val="1"/>
+      <w:numFmt w:val="bullet"/>
+      <w:lvlText w:val=""/>
+      <w:lvlJc w:val="left"/>
+      <w:pPr>
+        <w:ind w:left="720" w:hanging="360"/>
+      </w:pPr>
+      <w:rPr>
+        <w:rFonts w:ascii="Symbol" w:hAnsi="Symbol" w:hint="default"/>
+      </w:rPr>
+    </w:lvl>
+    <w:lvl w:ilvl="1" w:tplc="08090003" w:tentative="1">
+      <w:start w:val="1"/>
+      <w:numFmt w:val="bullet"/>
+      <w:lvlText w:val="o"/>
+      <w:lvlJc w:val="left"/>
+      <w:pPr>
+        <w:ind w:left="1440" w:hanging="360"/>
+      </w:pPr>
+      <w:rPr>
+        <w:rFonts w:ascii="Courier New" w:hAnsi="Courier New" w:cs="Courier New" w:hint="default"/>
+      </w:rPr>
+    </w:lvl>
+    <w:lvl w:ilvl="2" w:tplc="08090005" w:tentative="1">
+      <w:start w:val="1"/>
+      <w:numFmt w:val="bullet"/>
+      <w:lvlText w:val=""/>
+      <w:lvlJc w:val="left"/>
+      <w:pPr>
+        <w:ind w:left="2160" w:hanging="360"/>
+      </w:pPr>
+      <w:rPr>
+        <w:rFonts w:ascii="Wingdings" w:hAnsi="Wingdings" w:hint="default"/>
+      </w:rPr>
+    </w:lvl>
+    <w:lvl w:ilvl="3" w:tplc="08090001" w:tentative="1">
+      <w:start w:val="1"/>
+      <w:numFmt w:val="bullet"/>
+      <w:lvlText w:val=""/>
+      <w:lvlJc w:val="left"/>
+      <w:pPr>
+        <w:ind w:left="2880" w:hanging="360"/>
+      </w:pPr>
+      <w:rPr>
+        <w:rFonts w:ascii="Symbol" w:hAnsi="Symbol" w:hint="default"/>
+      </w:rPr>
+    </w:lvl>
+    <w:lvl w:ilvl="4" w:tplc="08090003" w:tentative="1">
+      <w:start w:val="1"/>
+      <w:numFmt w:val="bullet"/>
+      <w:lvlText w:val="o"/>
+      <w:lvlJc w:val="left"/>
+      <w:pPr>
+        <w:ind w:left="3600" w:hanging="360"/>
+      </w:pPr>
+      <w:rPr>
+        <w:rFonts w:ascii="Courier New" w:hAnsi="Courier New" w:cs="Courier New" w:hint="default"/>
+      </w:rPr>
+    </w:lvl>
+    <w:lvl w:ilvl="5" w:tplc="08090005" w:tentative="1">
+      <w:start w:val="1"/>
+      <w:numFmt w:val="bullet"/>
+      <w:lvlText w:val=""/>
+      <w:lvlJc w:val="left"/>
+      <w:pPr>
+        <w:ind w:left="4320" w:hanging="360"/>
+      </w:pPr>
+      <w:rPr>
+        <w:rFonts w:ascii="Wingdings" w:hAnsi="Wingdings" w:hint="default"/>
+      </w:rPr>
+    </w:lvl>
+    <w:lvl w:ilvl="6" w:tplc="08090001" w:tentative="1">
+      <w:start w:val="1"/>
+      <w:numFmt w:val="bullet"/>
+      <w:lvlText w:val=""/>
+      <w:lvlJc w:val="left"/>
+      <w:pPr>
+        <w:ind w:left="5040" w:hanging="360"/>
+      </w:pPr>
+      <w:rPr>
+        <w:rFonts w:ascii="Symbol" w:hAnsi="Symbol" w:hint="default"/>
+      </w:rPr>
+    </w:lvl>
+    <w:lvl w:ilvl="7" w:tplc="08090003" w:tentative="1">
+      <w:start w:val="1"/>
+      <w:numFmt w:val="bullet"/>
+      <w:lvlText w:val="o"/>
+      <w:lvlJc w:val="left"/>
+      <w:pPr>
+        <w:ind w:left="5760" w:hanging="360"/>
+      </w:pPr>
+      <w:rPr>
+        <w:rFonts w:ascii="Courier New" w:hAnsi="Courier New" w:cs="Courier New" w:hint="default"/>
+      </w:rPr>
+    </w:lvl>
+    <w:lvl w:ilvl="8" w:tplc="08090005" w:tentative="1">
+      <w:start w:val="1"/>
+      <w:numFmt w:val="bullet"/>
+      <w:lvlText w:val=""/>
+      <w:lvlJc w:val="left"/>
+      <w:pPr>
+        <w:ind w:left="6480" w:hanging="360"/>
+      </w:pPr>
+      <w:rPr>
+        <w:rFonts w:ascii="Wingdings" w:hAnsi="Wingdings" w:hint="default"/>
+      </w:rPr>
+    </w:lvl>
+  </w:abstractNum>
+  <w:abstractNum w:abstractNumId="9" w15:restartNumberingAfterBreak="0">
     <w:nsid w:val="3DB501F5"/>
     <w:multiLevelType w:val="hybridMultilevel"/>
     <w:tmpl w:val="9E58028A"/>
@@ -2020,7 +2580,7 @@
       </w:rPr>
     </w:lvl>
   </w:abstractNum>
-  <w:abstractNum w:abstractNumId="7" w15:restartNumberingAfterBreak="0">
+  <w:abstractNum w:abstractNumId="10" w15:restartNumberingAfterBreak="0">
     <w:nsid w:val="3E1146D3"/>
     <w:multiLevelType w:val="hybridMultilevel"/>
     <w:tmpl w:val="944A49D4"/>
@@ -2133,7 +2693,7 @@
       </w:rPr>
     </w:lvl>
   </w:abstractNum>
-  <w:abstractNum w:abstractNumId="8" w15:restartNumberingAfterBreak="0">
+  <w:abstractNum w:abstractNumId="11" w15:restartNumberingAfterBreak="0">
     <w:nsid w:val="488B4025"/>
     <w:multiLevelType w:val="hybridMultilevel"/>
     <w:tmpl w:val="14881D68"/>
@@ -2246,7 +2806,7 @@
       </w:rPr>
     </w:lvl>
   </w:abstractNum>
-  <w:abstractNum w:abstractNumId="9" w15:restartNumberingAfterBreak="0">
+  <w:abstractNum w:abstractNumId="12" w15:restartNumberingAfterBreak="0">
     <w:nsid w:val="4AD34633"/>
     <w:multiLevelType w:val="hybridMultilevel"/>
     <w:tmpl w:val="3C4CB9A4"/>
@@ -2359,7 +2919,7 @@
       </w:rPr>
     </w:lvl>
   </w:abstractNum>
-  <w:abstractNum w:abstractNumId="10" w15:restartNumberingAfterBreak="0">
+  <w:abstractNum w:abstractNumId="13" w15:restartNumberingAfterBreak="0">
     <w:nsid w:val="514A3DF6"/>
     <w:multiLevelType w:val="multilevel"/>
     <w:tmpl w:val="9CCA9B34"/>
@@ -2508,7 +3068,7 @@
       </w:rPr>
     </w:lvl>
   </w:abstractNum>
-  <w:abstractNum w:abstractNumId="11" w15:restartNumberingAfterBreak="0">
+  <w:abstractNum w:abstractNumId="14" w15:restartNumberingAfterBreak="0">
     <w:nsid w:val="53C6166F"/>
     <w:multiLevelType w:val="hybridMultilevel"/>
     <w:tmpl w:val="BF1637CC"/>
@@ -2621,7 +3181,7 @@
       </w:rPr>
     </w:lvl>
   </w:abstractNum>
-  <w:abstractNum w:abstractNumId="12" w15:restartNumberingAfterBreak="0">
+  <w:abstractNum w:abstractNumId="15" w15:restartNumberingAfterBreak="0">
     <w:nsid w:val="61C931FC"/>
     <w:multiLevelType w:val="multilevel"/>
     <w:tmpl w:val="A95CD214"/>
@@ -2734,7 +3294,7 @@
       </w:rPr>
     </w:lvl>
   </w:abstractNum>
-  <w:abstractNum w:abstractNumId="13" w15:restartNumberingAfterBreak="0">
+  <w:abstractNum w:abstractNumId="16" w15:restartNumberingAfterBreak="0">
     <w:nsid w:val="66F64343"/>
     <w:multiLevelType w:val="multilevel"/>
     <w:tmpl w:val="3D8ED3C4"/>
@@ -2847,7 +3407,7 @@
       </w:rPr>
     </w:lvl>
   </w:abstractNum>
-  <w:abstractNum w:abstractNumId="14" w15:restartNumberingAfterBreak="0">
+  <w:abstractNum w:abstractNumId="17" w15:restartNumberingAfterBreak="0">
     <w:nsid w:val="70967C19"/>
     <w:multiLevelType w:val="hybridMultilevel"/>
     <w:tmpl w:val="34D420DC"/>
@@ -2960,7 +3520,7 @@
       </w:rPr>
     </w:lvl>
   </w:abstractNum>
-  <w:abstractNum w:abstractNumId="15" w15:restartNumberingAfterBreak="0">
+  <w:abstractNum w:abstractNumId="18" w15:restartNumberingAfterBreak="0">
     <w:nsid w:val="72991B8C"/>
     <w:multiLevelType w:val="hybridMultilevel"/>
     <w:tmpl w:val="1CE026DC"/>
@@ -3073,7 +3633,7 @@
       </w:rPr>
     </w:lvl>
   </w:abstractNum>
-  <w:abstractNum w:abstractNumId="16" w15:restartNumberingAfterBreak="0">
+  <w:abstractNum w:abstractNumId="19" w15:restartNumberingAfterBreak="0">
     <w:nsid w:val="7A893962"/>
     <w:multiLevelType w:val="hybridMultilevel"/>
     <w:tmpl w:val="6E16C486"/>
@@ -3186,7 +3746,7 @@
       </w:rPr>
     </w:lvl>
   </w:abstractNum>
-  <w:abstractNum w:abstractNumId="17" w15:restartNumberingAfterBreak="0">
+  <w:abstractNum w:abstractNumId="20" w15:restartNumberingAfterBreak="0">
     <w:nsid w:val="7D8A63E9"/>
     <w:multiLevelType w:val="hybridMultilevel"/>
     <w:tmpl w:val="56FEB16A"/>
@@ -3299,7 +3859,7 @@
       </w:rPr>
     </w:lvl>
   </w:abstractNum>
-  <w:abstractNum w:abstractNumId="18" w15:restartNumberingAfterBreak="0">
+  <w:abstractNum w:abstractNumId="21" w15:restartNumberingAfterBreak="0">
     <w:nsid w:val="7DA27CAB"/>
     <w:multiLevelType w:val="hybridMultilevel"/>
     <w:tmpl w:val="19EA8F56"/>
@@ -3413,61 +3973,70 @@
     </w:lvl>
   </w:abstractNum>
   <w:num w:numId="1" w16cid:durableId="605966100">
-    <w:abstractNumId w:val="13"/>
+    <w:abstractNumId w:val="16"/>
   </w:num>
   <w:num w:numId="2" w16cid:durableId="1690712513">
     <w:abstractNumId w:val="0"/>
   </w:num>
   <w:num w:numId="3" w16cid:durableId="14888913">
+    <w:abstractNumId w:val="15"/>
+  </w:num>
+  <w:num w:numId="4" w16cid:durableId="2070691912">
+    <w:abstractNumId w:val="11"/>
+  </w:num>
+  <w:num w:numId="5" w16cid:durableId="1132866593">
+    <w:abstractNumId w:val="7"/>
+  </w:num>
+  <w:num w:numId="6" w16cid:durableId="1334652095">
+    <w:abstractNumId w:val="14"/>
+  </w:num>
+  <w:num w:numId="7" w16cid:durableId="2079089524">
+    <w:abstractNumId w:val="4"/>
+  </w:num>
+  <w:num w:numId="8" w16cid:durableId="638457908">
+    <w:abstractNumId w:val="9"/>
+  </w:num>
+  <w:num w:numId="9" w16cid:durableId="1781022826">
+    <w:abstractNumId w:val="18"/>
+  </w:num>
+  <w:num w:numId="10" w16cid:durableId="1803233804">
+    <w:abstractNumId w:val="10"/>
+  </w:num>
+  <w:num w:numId="11" w16cid:durableId="812908966">
+    <w:abstractNumId w:val="19"/>
+  </w:num>
+  <w:num w:numId="12" w16cid:durableId="1742436830">
+    <w:abstractNumId w:val="20"/>
+  </w:num>
+  <w:num w:numId="13" w16cid:durableId="627005660">
+    <w:abstractNumId w:val="5"/>
+  </w:num>
+  <w:num w:numId="14" w16cid:durableId="1046756105">
+    <w:abstractNumId w:val="21"/>
+  </w:num>
+  <w:num w:numId="15" w16cid:durableId="2124811348">
+    <w:abstractNumId w:val="3"/>
+  </w:num>
+  <w:num w:numId="16" w16cid:durableId="136454871">
     <w:abstractNumId w:val="12"/>
   </w:num>
-  <w:num w:numId="4" w16cid:durableId="2070691912">
-    <w:abstractNumId w:val="8"/>
+  <w:num w:numId="17" w16cid:durableId="615139450">
+    <w:abstractNumId w:val="17"/>
   </w:num>
-  <w:num w:numId="5" w16cid:durableId="1132866593">
-    <w:abstractNumId w:val="5"/>
+  <w:num w:numId="18" w16cid:durableId="1330399915">
+    <w:abstractNumId w:val="13"/>
   </w:num>
-  <w:num w:numId="6" w16cid:durableId="1334652095">
-    <w:abstractNumId w:val="11"/>
+  <w:num w:numId="19" w16cid:durableId="1803109781">
+    <w:abstractNumId w:val="6"/>
   </w:num>
-  <w:num w:numId="7" w16cid:durableId="2079089524">
+  <w:num w:numId="20" w16cid:durableId="1004170356">
     <w:abstractNumId w:val="2"/>
   </w:num>
-  <w:num w:numId="8" w16cid:durableId="638457908">
-    <w:abstractNumId w:val="6"/>
-  </w:num>
-  <w:num w:numId="9" w16cid:durableId="1781022826">
-    <w:abstractNumId w:val="15"/>
-  </w:num>
-  <w:num w:numId="10" w16cid:durableId="1803233804">
-    <w:abstractNumId w:val="7"/>
-  </w:num>
-  <w:num w:numId="11" w16cid:durableId="812908966">
-    <w:abstractNumId w:val="16"/>
-  </w:num>
-  <w:num w:numId="12" w16cid:durableId="1742436830">
-    <w:abstractNumId w:val="17"/>
-  </w:num>
-  <w:num w:numId="13" w16cid:durableId="627005660">
-    <w:abstractNumId w:val="3"/>
-  </w:num>
-  <w:num w:numId="14" w16cid:durableId="1046756105">
-    <w:abstractNumId w:val="18"/>
-  </w:num>
-  <w:num w:numId="15" w16cid:durableId="2124811348">
+  <w:num w:numId="21" w16cid:durableId="546187393">
     <w:abstractNumId w:val="1"/>
   </w:num>
-  <w:num w:numId="16" w16cid:durableId="136454871">
-    <w:abstractNumId w:val="9"/>
-  </w:num>
-  <w:num w:numId="17" w16cid:durableId="615139450">
-    <w:abstractNumId w:val="14"/>
-  </w:num>
-  <w:num w:numId="18" w16cid:durableId="1330399915">
-    <w:abstractNumId w:val="10"/>
-  </w:num>
-  <w:num w:numId="19" w16cid:durableId="1803109781">
-    <w:abstractNumId w:val="4"/>
+  <w:num w:numId="22" w16cid:durableId="742025888">
+    <w:abstractNumId w:val="8"/>
   </w:num>
 </w:numbering>
 </file>
@@ -4122,6 +4691,48 @@
       <w:lang w:val="en-AU" w:eastAsia="zh-CN"/>
     </w:rPr>
   </w:style>
+  <w:style w:type="paragraph" w:styleId="Header">
+    <w:name w:val="header"/>
+    <w:basedOn w:val="Normal"/>
+    <w:link w:val="HeaderChar"/>
+    <w:uiPriority w:val="99"/>
+    <w:unhideWhenUsed/>
+    <w:rsid w:val="004C3B0D"/>
+    <w:pPr>
+      <w:tabs>
+        <w:tab w:val="center" w:pos="4513"/>
+        <w:tab w:val="right" w:pos="9026"/>
+      </w:tabs>
+    </w:pPr>
+  </w:style>
+  <w:style w:type="character" w:customStyle="1" w:styleId="HeaderChar">
+    <w:name w:val="Header Char"/>
+    <w:basedOn w:val="DefaultParagraphFont"/>
+    <w:link w:val="Header"/>
+    <w:uiPriority w:val="99"/>
+    <w:rsid w:val="004C3B0D"/>
+  </w:style>
+  <w:style w:type="paragraph" w:styleId="Footer">
+    <w:name w:val="footer"/>
+    <w:basedOn w:val="Normal"/>
+    <w:link w:val="FooterChar"/>
+    <w:uiPriority w:val="99"/>
+    <w:unhideWhenUsed/>
+    <w:rsid w:val="004C3B0D"/>
+    <w:pPr>
+      <w:tabs>
+        <w:tab w:val="center" w:pos="4513"/>
+        <w:tab w:val="right" w:pos="9026"/>
+      </w:tabs>
+    </w:pPr>
+  </w:style>
+  <w:style w:type="character" w:customStyle="1" w:styleId="FooterChar">
+    <w:name w:val="Footer Char"/>
+    <w:basedOn w:val="DefaultParagraphFont"/>
+    <w:link w:val="Footer"/>
+    <w:uiPriority w:val="99"/>
+    <w:rsid w:val="004C3B0D"/>
+  </w:style>
 </w:styles>
 </file>
 

</xml_diff>